<commit_message>
Add implementation approach, table-keys-constraints, and sample data summaries
</commit_message>
<xml_diff>
--- a/report/04_Physical_Model_and_Implementation.docx
+++ b/report/04_Physical_Model_and_Implementation.docx
@@ -3,8 +3,120 @@
 <w:document xmlns:ve="http://schemas.openxmlformats.org/markup-compatibility/2006" xmlns:o="urn:schemas-microsoft-com:office:office" xmlns:r="http://schemas.openxmlformats.org/officeDocument/2006/relationships" xmlns:m="http://schemas.openxmlformats.org/officeDocument/2006/math" xmlns:v="urn:schemas-microsoft-com:vml" xmlns:wp="http://schemas.openxmlformats.org/drawingml/2006/wordprocessingDrawing" xmlns:w10="urn:schemas-microsoft-com:office:word" xmlns:w="http://schemas.openxmlformats.org/wordprocessingml/2006/main" xmlns:wne="http://schemas.microsoft.com/office/word/2006/wordml">
   <w:body>
     <w:p>
-      <w:r>
-        <w:t>Physical Model; Database Implementation Summary</w:t>
+      <w:pPr>
+        <w:pStyle w:val="Heading1"/>
+      </w:pPr>
+      <w:r>
+        <w:t>Physical Model</w:t>
+      </w:r>
+    </w:p>
+    <w:p>
+      <w:pPr>
+        <w:pStyle w:val="Heading2"/>
+      </w:pPr>
+      <w:r>
+        <w:t>Implementation Approach</w:t>
+      </w:r>
+    </w:p>
+    <w:p>
+      <w:r>
+        <w:t xml:space="preserve">The physical database was implemented in </w:t>
+      </w:r>
+      <w:proofErr w:type="spellStart"/>
+      <w:r>
+        <w:t>PostgreSQL</w:t>
+      </w:r>
+      <w:proofErr w:type="spellEnd"/>
+      <w:r>
+        <w:t xml:space="preserve"> as the </w:t>
+      </w:r>
+      <w:r>
+        <w:rPr>
+          <w:rStyle w:val="HTMLCode"/>
+          <w:rFonts w:eastAsiaTheme="majorEastAsia"/>
+        </w:rPr>
+        <w:t>dominos</w:t>
+      </w:r>
+      <w:r>
+        <w:t xml:space="preserve"> schema. The Version 1.3 build script drops and recreates the schema so the project can be reproduced from a clean state with one execution. The script creates 20 tables, supporting indexes, and four views. It then loads synthetic September 2026 data, runs validation checks, and provides ten business queries. This approach makes the database repeatable and allows design changes to be tested against a consistent data set.</w:t>
+      </w:r>
+    </w:p>
+    <w:p>
+      <w:pPr>
+        <w:pStyle w:val="Heading2"/>
+      </w:pPr>
+      <w:r>
+        <w:t>Tables, Keys, and Constraints</w:t>
+      </w:r>
+    </w:p>
+    <w:p>
+      <w:r>
+        <w:t xml:space="preserve">The model uses identity-based integer primary keys for its major entities and foreign keys to enforce relationships between customers, orders, menu items, payments, loyalty activity, and subscriptions. Junction tables resolve many-to-many relationships where needed, including </w:t>
+      </w:r>
+      <w:r>
+        <w:rPr>
+          <w:rStyle w:val="HTMLCode"/>
+          <w:rFonts w:eastAsiaTheme="majorEastAsia"/>
+        </w:rPr>
+        <w:t>ORDER_ITEM_CUSTOMIZATION</w:t>
+      </w:r>
+      <w:r>
+        <w:t xml:space="preserve"> and </w:t>
+      </w:r>
+      <w:r>
+        <w:rPr>
+          <w:rStyle w:val="HTMLCode"/>
+          <w:rFonts w:eastAsiaTheme="majorEastAsia"/>
+        </w:rPr>
+        <w:t>ORDER_PROMOTION</w:t>
+      </w:r>
+      <w:r>
+        <w:t>. The implementation uses check constraints to limit values such as fulfillment type, payment status, order status, product variation, and nonnegative monetary amounts. Unique constraints and indexes prevent duplicate customer emails, store numbers, promotion codes, store-specific menu offerings, and duplicate active subscriptions. These controls protect the consistency of the transactional data while preserving the historical values recorded when an order is submitted.</w:t>
+      </w:r>
+    </w:p>
+    <w:p>
+      <w:pPr>
+        <w:pStyle w:val="Heading2"/>
+      </w:pPr>
+      <w:r>
+        <w:t>Sample Data</w:t>
+      </w:r>
+    </w:p>
+    <w:p>
+      <w:r>
+        <w:t>All database records are synthetic and do not represent Domino’s customers, stores, menu offerings, prices, or policies. The seed data represents September 2026 activity across three sample stores. It includes 15 registered customers, customer and guest delivery addresses, store-specific menu offerings, 60 orders, 135 order items, payment attempts, order-status events, promotions, loyalty transactions, and Meal Club subscription activity. The data set is large enough to demonstrate ordering, fulfillment, promotion, loyalty, subscription, and reporting scenarios without using real customer information.</w:t>
+      </w:r>
+    </w:p>
+    <w:p>
+      <w:pPr>
+        <w:pStyle w:val="Heading1"/>
+      </w:pPr>
+      <w:r>
+        <w:t>Database Implementation Summary</w:t>
+      </w:r>
+    </w:p>
+    <w:p>
+      <w:pPr>
+        <w:pStyle w:val="Heading2"/>
+      </w:pPr>
+      <w:r>
+        <w:t>Intentional Imperfect Data</w:t>
+      </w:r>
+    </w:p>
+    <w:p>
+      <w:pPr>
+        <w:pStyle w:val="Heading2"/>
+      </w:pPr>
+      <w:r>
+        <w:t>Data-Quality Impact and Prevention</w:t>
+      </w:r>
+    </w:p>
+    <w:p>
+      <w:pPr>
+        <w:pStyle w:val="Heading2"/>
+      </w:pPr>
+      <w:r>
+        <w:t>Integrity Enforcement</w:t>
       </w:r>
     </w:p>
     <w:sectPr>
@@ -178,6 +290,53 @@
     <w:qFormat/>
     <w:rsid w:val="00CF7D49"/>
   </w:style>
+  <w:style w:type="paragraph" w:styleId="Heading1">
+    <w:name w:val="heading 1"/>
+    <w:basedOn w:val="Normal"/>
+    <w:next w:val="Normal"/>
+    <w:link w:val="Heading1Char"/>
+    <w:uiPriority w:val="9"/>
+    <w:qFormat/>
+    <w:rsid w:val="001B6B06"/>
+    <w:pPr>
+      <w:keepNext/>
+      <w:keepLines/>
+      <w:spacing w:before="480" w:after="0"/>
+      <w:outlineLvl w:val="0"/>
+    </w:pPr>
+    <w:rPr>
+      <w:rFonts w:asciiTheme="majorHAnsi" w:eastAsiaTheme="majorEastAsia" w:hAnsiTheme="majorHAnsi" w:cstheme="majorBidi"/>
+      <w:b/>
+      <w:bCs/>
+      <w:color w:val="365F91" w:themeColor="accent1" w:themeShade="BF"/>
+      <w:sz w:val="28"/>
+      <w:szCs w:val="28"/>
+    </w:rPr>
+  </w:style>
+  <w:style w:type="paragraph" w:styleId="Heading2">
+    <w:name w:val="heading 2"/>
+    <w:basedOn w:val="Normal"/>
+    <w:next w:val="Normal"/>
+    <w:link w:val="Heading2Char"/>
+    <w:uiPriority w:val="9"/>
+    <w:unhideWhenUsed/>
+    <w:qFormat/>
+    <w:rsid w:val="001B6B06"/>
+    <w:pPr>
+      <w:keepNext/>
+      <w:keepLines/>
+      <w:spacing w:before="200" w:after="0"/>
+      <w:outlineLvl w:val="1"/>
+    </w:pPr>
+    <w:rPr>
+      <w:rFonts w:asciiTheme="majorHAnsi" w:eastAsiaTheme="majorEastAsia" w:hAnsiTheme="majorHAnsi" w:cstheme="majorBidi"/>
+      <w:b/>
+      <w:bCs/>
+      <w:color w:val="4F81BD" w:themeColor="accent1"/>
+      <w:sz w:val="26"/>
+      <w:szCs w:val="26"/>
+    </w:rPr>
+  </w:style>
   <w:style w:type="character" w:default="1" w:styleId="DefaultParagraphFont">
     <w:name w:val="Default Paragraph Font"/>
     <w:uiPriority w:val="1"/>
@@ -205,6 +364,49 @@
     <w:uiPriority w:val="99"/>
     <w:semiHidden/>
     <w:unhideWhenUsed/>
+  </w:style>
+  <w:style w:type="character" w:customStyle="1" w:styleId="Heading1Char">
+    <w:name w:val="Heading 1 Char"/>
+    <w:basedOn w:val="DefaultParagraphFont"/>
+    <w:link w:val="Heading1"/>
+    <w:uiPriority w:val="9"/>
+    <w:rsid w:val="001B6B06"/>
+    <w:rPr>
+      <w:rFonts w:asciiTheme="majorHAnsi" w:eastAsiaTheme="majorEastAsia" w:hAnsiTheme="majorHAnsi" w:cstheme="majorBidi"/>
+      <w:b/>
+      <w:bCs/>
+      <w:color w:val="365F91" w:themeColor="accent1" w:themeShade="BF"/>
+      <w:sz w:val="28"/>
+      <w:szCs w:val="28"/>
+    </w:rPr>
+  </w:style>
+  <w:style w:type="character" w:customStyle="1" w:styleId="Heading2Char">
+    <w:name w:val="Heading 2 Char"/>
+    <w:basedOn w:val="DefaultParagraphFont"/>
+    <w:link w:val="Heading2"/>
+    <w:uiPriority w:val="9"/>
+    <w:rsid w:val="001B6B06"/>
+    <w:rPr>
+      <w:rFonts w:asciiTheme="majorHAnsi" w:eastAsiaTheme="majorEastAsia" w:hAnsiTheme="majorHAnsi" w:cstheme="majorBidi"/>
+      <w:b/>
+      <w:bCs/>
+      <w:color w:val="4F81BD" w:themeColor="accent1"/>
+      <w:sz w:val="26"/>
+      <w:szCs w:val="26"/>
+    </w:rPr>
+  </w:style>
+  <w:style w:type="character" w:styleId="HTMLCode">
+    <w:name w:val="HTML Code"/>
+    <w:basedOn w:val="DefaultParagraphFont"/>
+    <w:uiPriority w:val="99"/>
+    <w:semiHidden/>
+    <w:unhideWhenUsed/>
+    <w:rsid w:val="001B6B06"/>
+    <w:rPr>
+      <w:rFonts w:ascii="Courier New" w:eastAsia="Times New Roman" w:hAnsi="Courier New" w:cs="Courier New"/>
+      <w:sz w:val="20"/>
+      <w:szCs w:val="20"/>
+    </w:rPr>
   </w:style>
 </w:styles>
 </file>

</xml_diff>

<commit_message>
Add database implementation summary; revise implementation approach
</commit_message>
<xml_diff>
--- a/report/04_Physical_Model_and_Implementation.docx
+++ b/report/04_Physical_Model_and_Implementation.docx
@@ -28,17 +28,15 @@
       </w:r>
       <w:proofErr w:type="spellEnd"/>
       <w:r>
-        <w:t xml:space="preserve"> as the </w:t>
-      </w:r>
-      <w:r>
-        <w:rPr>
-          <w:rStyle w:val="HTMLCode"/>
-          <w:rFonts w:eastAsiaTheme="majorEastAsia"/>
-        </w:rPr>
-        <w:t>dominos</w:t>
-      </w:r>
-      <w:r>
-        <w:t xml:space="preserve"> schema. The Version 1.3 build script drops and recreates the schema so the project can be reproduced from a clean state with one execution. The script creates 20 tables, supporting indexes, and four views. It then loads synthetic September 2026 data, runs validation checks, and provides ten business queries. This approach makes the database repeatable and allows design changes to be tested against a consistent data set.</w:t>
+        <w:t xml:space="preserve"> as the dominos schema. The Version 1.3 build script drops and recreates the schema. </w:t>
+      </w:r>
+      <w:r>
+        <w:t>The script can rebuild the database from a clean state with one execution.</w:t>
+      </w:r>
+    </w:p>
+    <w:p>
+      <w:r>
+        <w:t>The script creates 20 tables, supporting indexes, and four views. It loads synthetic September 2026 data, runs validation checks, and provides ten business queries. This approach makes the database repeatable and gives the team a consistent dataset for testing design changes.</w:t>
       </w:r>
     </w:p>
     <w:p>
@@ -51,27 +49,17 @@
     </w:p>
     <w:p>
       <w:r>
-        <w:t xml:space="preserve">The model uses identity-based integer primary keys for its major entities and foreign keys to enforce relationships between customers, orders, menu items, payments, loyalty activity, and subscriptions. Junction tables resolve many-to-many relationships where needed, including </w:t>
-      </w:r>
-      <w:r>
-        <w:rPr>
-          <w:rStyle w:val="HTMLCode"/>
-          <w:rFonts w:eastAsiaTheme="majorEastAsia"/>
-        </w:rPr>
-        <w:t>ORDER_ITEM_CUSTOMIZATION</w:t>
-      </w:r>
-      <w:r>
-        <w:t xml:space="preserve"> and </w:t>
-      </w:r>
-      <w:r>
-        <w:rPr>
-          <w:rStyle w:val="HTMLCode"/>
-          <w:rFonts w:eastAsiaTheme="majorEastAsia"/>
-        </w:rPr>
-        <w:t>ORDER_PROMOTION</w:t>
-      </w:r>
-      <w:r>
-        <w:t>. The implementation uses check constraints to limit values such as fulfillment type, payment status, order status, product variation, and nonnegative monetary amounts. Unique constraints and indexes prevent duplicate customer emails, store numbers, promotion codes, store-specific menu offerings, and duplicate active subscriptions. These controls protect the consistency of the transactional data while preserving the historical values recorded when an order is submitted.</w:t>
+        <w:t>The model uses integer identity primary keys and foreign keys to enforce relationships between tables. These relationships connect customers, orders, menu items, payments, loyalty activity, and subscriptions.</w:t>
+      </w:r>
+    </w:p>
+    <w:p>
+      <w:r>
+        <w:t>ORDER_ITEM_CUSTOMIZATION and ORDER_PROMOTION resolve many-to-many relationships. Check constraints limit values such as fulfillment type, payment status, order status, product variation, and monetary amounts. Unique constraints prevent duplicate customer emails, store numbers, promotion codes, and store-specific menu offerings. The model also allows only one active subscription per customer.</w:t>
+      </w:r>
+    </w:p>
+    <w:p>
+      <w:r>
+        <w:t>The order tables retain the prices and discounts charged when the order was placed. This preserves order history even if menu prices change later.</w:t>
       </w:r>
     </w:p>
     <w:p>
@@ -84,7 +72,12 @@
     </w:p>
     <w:p>
       <w:r>
-        <w:t>All database records are synthetic and do not represent Domino’s customers, stores, menu offerings, prices, or policies. The seed data represents September 2026 activity across three sample stores. It includes 15 registered customers, customer and guest delivery addresses, store-specific menu offerings, 60 orders, 135 order items, payment attempts, order-status events, promotions, loyalty transactions, and Meal Club subscription activity. The data set is large enough to demonstrate ordering, fulfillment, promotion, loyalty, subscription, and reporting scenarios without using real customer information.</w:t>
+        <w:t>All records are synthetic. They do not represent Domino’s customers, stores, menu offerings, prices, or policies.</w:t>
+      </w:r>
+    </w:p>
+    <w:p>
+      <w:r>
+        <w:t>The seed data represents September 2026 activity across three sample stores. It includes 15 registered customers, customer and guest delivery addresses, store-specific menu offerings, 60 orders, 135 order items, payment attempts, order-status events, promotions, loyalty transactions, and Meal Club subscription activity. The data supports ordering, fulfillment, promotion, loyalty, subscription, and reporting scenarios without using real customer information.</w:t>
       </w:r>
     </w:p>
     <w:p>
@@ -104,6 +97,17 @@
       </w:r>
     </w:p>
     <w:p>
+      <w:r>
+        <w:t>The seed data includes intentional data-quality issues in three tables. Customer 4 has name-formatting issues. Two address records are duplicates. Store 3 has a missing phone number.</w:t>
+      </w:r>
+    </w:p>
+    <w:p>
+      <w:r>
+        <w:lastRenderedPageBreak/>
+        <w:t>These records do not violate the database’s structural rules. They represent issues that a real organization may need to identify through data-quality reporting.</w:t>
+      </w:r>
+    </w:p>
+    <w:p>
       <w:pPr>
         <w:pStyle w:val="Heading2"/>
       </w:pPr>
@@ -112,11 +116,31 @@
       </w:r>
     </w:p>
     <w:p>
+      <w:r>
+        <w:t>Bad data can cause customer-service problems and inaccurate reports. A missing store phone number can make it harder for customers or staff to contact the store. Duplicate addresses can produce misleading customer-address counts. Poorly formatted names can reduce the quality of customer-facing communication.</w:t>
+      </w:r>
+    </w:p>
+    <w:p>
+      <w:r>
+        <w:t>In production, the ordering application should require the information needed for each record. It should apply consistent formatting rules before saving customer data. Staff should review exceptions, and the business should run reports that flag incomplete or duplicate records.</w:t>
+      </w:r>
+    </w:p>
+    <w:p>
       <w:pPr>
         <w:pStyle w:val="Heading2"/>
       </w:pPr>
       <w:r>
         <w:t>Integrity Enforcement</w:t>
+      </w:r>
+    </w:p>
+    <w:p>
+      <w:r>
+        <w:t>Primary keys and foreign keys enforce the core relationships in the database. Check constraints prevent invalid statuses, unsupported fulfillment types, and negative monetary values. Unique constraints prevent duplicate values where the business requires them.</w:t>
+      </w:r>
+    </w:p>
+    <w:p>
+      <w:r>
+        <w:t>The script also includes an integrity-audit view. It checks cross-table rules that are not enforced automatically by a single table constraint. For example, it checks whether an order item belongs to the correct store and whether a completed order has matching successful payments. The build script stops with an error if the audit finds an integrity issue.</w:t>
       </w:r>
     </w:p>
     <w:sectPr>

</xml_diff>

<commit_message>
Add data integrity screenshots.
</commit_message>
<xml_diff>
--- a/report/04_Physical_Model_and_Implementation.docx
+++ b/report/04_Physical_Model_and_Implementation.docx
@@ -7,7 +7,7 @@
         <w:pStyle w:val="Heading1"/>
       </w:pPr>
       <w:r>
-        <w:t>Physical Model</w:t>
+        <w:t>Physical Model and Database Implementation</w:t>
       </w:r>
     </w:p>
     <w:p>
@@ -28,38 +28,90 @@
       </w:r>
       <w:proofErr w:type="spellEnd"/>
       <w:r>
-        <w:t xml:space="preserve"> as the dominos schema. The Version 1.3 build script drops and recreates the schema. </w:t>
-      </w:r>
-      <w:r>
-        <w:t>The script can rebuild the database from a clean state with one execution.</w:t>
-      </w:r>
-    </w:p>
-    <w:p>
-      <w:r>
-        <w:t>The script creates 20 tables, supporting indexes, and four views. It loads synthetic September 2026 data, runs validation checks, and provides ten business queries. This approach makes the database repeatable and gives the team a consistent dataset for testing design changes.</w:t>
-      </w:r>
+        <w:t>. The final build script recreates the database from a clean state, loads the synthetic dataset, runs validation checks, and provides the ten business queries. This makes the implementation repeatable and gives the team a consistent environment for testing design changes.</w:t>
+      </w:r>
+    </w:p>
+    <w:p>
+      <w:r>
+        <w:t>The database contains 20 tables, supporting indexes, and views. It supports the full online-ordering workflow as well as the proposed Meal Club subscription service.</w:t>
+      </w:r>
+    </w:p>
+    <w:p>
+      <w:proofErr w:type="gramStart"/>
+      <w:r>
+        <w:t>Figure 11.</w:t>
+      </w:r>
+      <w:proofErr w:type="gramEnd"/>
+      <w:r>
+        <w:t xml:space="preserve"> </w:t>
+      </w:r>
+      <w:proofErr w:type="gramStart"/>
+      <w:r>
+        <w:t>Successful database build and integrity-validation results for the Domino’s online-ordering database.</w:t>
+      </w:r>
+      <w:proofErr w:type="gramEnd"/>
     </w:p>
     <w:p>
       <w:pPr>
         <w:pStyle w:val="Heading2"/>
       </w:pPr>
       <w:r>
+        <w:rPr>
+          <w:noProof/>
+        </w:rPr>
+        <w:drawing>
+          <wp:inline distT="0" distB="0" distL="0" distR="0">
+            <wp:extent cx="3904364" cy="1487914"/>
+            <wp:effectExtent l="19050" t="0" r="886" b="0"/>
+            <wp:docPr id="2" name="Picture 1" descr="Dominos_v1.4_IntegrityAudit_PASS.png"/>
+            <wp:cNvGraphicFramePr>
+              <a:graphicFrameLocks xmlns:a="http://schemas.openxmlformats.org/drawingml/2006/main" noChangeAspect="1"/>
+            </wp:cNvGraphicFramePr>
+            <a:graphic xmlns:a="http://schemas.openxmlformats.org/drawingml/2006/main">
+              <a:graphicData uri="http://schemas.openxmlformats.org/drawingml/2006/picture">
+                <pic:pic xmlns:pic="http://schemas.openxmlformats.org/drawingml/2006/picture">
+                  <pic:nvPicPr>
+                    <pic:cNvPr id="0" name="Dominos_v1.4_IntegrityAudit_PASS.png"/>
+                    <pic:cNvPicPr/>
+                  </pic:nvPicPr>
+                  <pic:blipFill>
+                    <a:blip r:embed="rId4"/>
+                    <a:stretch>
+                      <a:fillRect/>
+                    </a:stretch>
+                  </pic:blipFill>
+                  <pic:spPr>
+                    <a:xfrm>
+                      <a:off x="0" y="0"/>
+                      <a:ext cx="3909631" cy="1489921"/>
+                    </a:xfrm>
+                    <a:prstGeom prst="rect">
+                      <a:avLst/>
+                    </a:prstGeom>
+                  </pic:spPr>
+                </pic:pic>
+              </a:graphicData>
+            </a:graphic>
+          </wp:inline>
+        </w:drawing>
+      </w:r>
+    </w:p>
+    <w:p>
+      <w:pPr>
+        <w:pStyle w:val="Heading2"/>
+      </w:pPr>
+      <w:r>
         <w:t>Tables, Keys, and Constraints</w:t>
       </w:r>
     </w:p>
     <w:p>
       <w:r>
-        <w:t>The model uses integer identity primary keys and foreign keys to enforce relationships between tables. These relationships connect customers, orders, menu items, payments, loyalty activity, and subscriptions.</w:t>
-      </w:r>
-    </w:p>
-    <w:p>
-      <w:r>
-        <w:t>ORDER_ITEM_CUSTOMIZATION and ORDER_PROMOTION resolve many-to-many relationships. Check constraints limit values such as fulfillment type, payment status, order status, product variation, and monetary amounts. Unique constraints prevent duplicate customer emails, store numbers, promotion codes, and store-specific menu offerings. The model also allows only one active subscription per customer.</w:t>
-      </w:r>
-    </w:p>
-    <w:p>
-      <w:r>
-        <w:t>The order tables retain the prices and discounts charged when the order was placed. This preserves order history even if menu prices change later.</w:t>
+        <w:t>The model uses identity primary keys and foreign keys to enforce relationships among customers, orders, menu items, payments, loyalty activity, and subscriptions. ORDER_ITEM_CUSTOMIZATION and ORDER_PROMOTION resolve many-to-many relationships that emerged as the conceptual design was translated into a normalized logical model.</w:t>
+      </w:r>
+    </w:p>
+    <w:p>
+      <w:r>
+        <w:t>Check constraints limit values such as fulfillment type, payment status, order status, product variation, and monetary amounts. Unique constraints prevent duplicate customer emails, store numbers, promotion codes, and store-specific menu offerings. The model also allows only one active subscription per customer. Order tables retain the prices and discounts charged when an order is placed so that historical reporting remains accurate when current prices or promotions change.</w:t>
       </w:r>
     </w:p>
     <w:p>
@@ -72,12 +124,16 @@
     </w:p>
     <w:p>
       <w:r>
-        <w:t>All records are synthetic. They do not represent Domino’s customers, stores, menu offerings, prices, or policies.</w:t>
-      </w:r>
-    </w:p>
-    <w:p>
-      <w:r>
-        <w:t>The seed data represents September 2026 activity across three sample stores. It includes 15 registered customers, customer and guest delivery addresses, store-specific menu offerings, 60 orders, 135 order items, payment attempts, order-status events, promotions, loyalty transactions, and Meal Club subscription activity. The data supports ordering, fulfillment, promotion, loyalty, subscription, and reporting scenarios without using real customer information.</w:t>
+        <w:t xml:space="preserve">All records are synthetic and do not represent Domino’s customers, stores, menu offerings, prices, or policies. The seed data represents activity across three sample stores and includes ordering, fulfillment, </w:t>
+      </w:r>
+      <w:proofErr w:type="gramStart"/>
+      <w:r>
+        <w:lastRenderedPageBreak/>
+        <w:t>promotion</w:t>
+      </w:r>
+      <w:proofErr w:type="gramEnd"/>
+      <w:r>
+        <w:t>, loyalty, and Meal Club scenarios. It gives the database enough variation to support reporting and test the business rules represented in the model.</w:t>
       </w:r>
     </w:p>
     <w:p>
@@ -98,49 +154,179 @@
     </w:p>
     <w:p>
       <w:r>
-        <w:t>The seed data includes intentional data-quality issues in three tables. Customer 4 has name-formatting issues. Two address records are duplicates. Store 3 has a missing phone number.</w:t>
-      </w:r>
-    </w:p>
-    <w:p>
+        <w:t>The seed data includes intentional data-quality issues in three tables. Customer 4 has name-formatting issues, two address records are duplicates, and Store 3 has a missing phone number. These records do not violate structural rules, but they represent the kinds of quality issues a real organization must identify and manage.</w:t>
+      </w:r>
+    </w:p>
+    <w:p>
+      <w:proofErr w:type="gramStart"/>
+      <w:r>
+        <w:t>Figure 12.</w:t>
+      </w:r>
+      <w:proofErr w:type="gramEnd"/>
+      <w:r>
+        <w:t xml:space="preserve"> Intentional imperfect data included for data-quality analysis: (a) inconsistent customer name formatting, (b) duplicate address values, and (c) a missing store phone number. </w:t>
+      </w:r>
+    </w:p>
+    <w:p>
+      <w:pPr>
+        <w:pStyle w:val="Heading2"/>
+      </w:pPr>
+      <w:r>
+        <w:rPr>
+          <w:noProof/>
+        </w:rPr>
+        <w:drawing>
+          <wp:inline distT="0" distB="0" distL="0" distR="0">
+            <wp:extent cx="3519052" cy="985334"/>
+            <wp:effectExtent l="19050" t="0" r="5198" b="0"/>
+            <wp:docPr id="3" name="Picture 2" descr="Dominos_v1.4_ImperfectData_CustomerFormatting.png"/>
+            <wp:cNvGraphicFramePr>
+              <a:graphicFrameLocks xmlns:a="http://schemas.openxmlformats.org/drawingml/2006/main" noChangeAspect="1"/>
+            </wp:cNvGraphicFramePr>
+            <a:graphic xmlns:a="http://schemas.openxmlformats.org/drawingml/2006/main">
+              <a:graphicData uri="http://schemas.openxmlformats.org/drawingml/2006/picture">
+                <pic:pic xmlns:pic="http://schemas.openxmlformats.org/drawingml/2006/picture">
+                  <pic:nvPicPr>
+                    <pic:cNvPr id="0" name="Dominos_v1.4_ImperfectData_CustomerFormatting.png"/>
+                    <pic:cNvPicPr/>
+                  </pic:nvPicPr>
+                  <pic:blipFill>
+                    <a:blip r:embed="rId5"/>
+                    <a:stretch>
+                      <a:fillRect/>
+                    </a:stretch>
+                  </pic:blipFill>
+                  <pic:spPr>
+                    <a:xfrm>
+                      <a:off x="0" y="0"/>
+                      <a:ext cx="3523695" cy="986634"/>
+                    </a:xfrm>
+                    <a:prstGeom prst="rect">
+                      <a:avLst/>
+                    </a:prstGeom>
+                  </pic:spPr>
+                </pic:pic>
+              </a:graphicData>
+            </a:graphic>
+          </wp:inline>
+        </w:drawing>
+      </w:r>
+    </w:p>
+    <w:p>
+      <w:pPr>
+        <w:pStyle w:val="Heading2"/>
+      </w:pPr>
+      <w:r>
+        <w:rPr>
+          <w:noProof/>
+        </w:rPr>
+        <w:drawing>
+          <wp:inline distT="0" distB="0" distL="0" distR="0">
+            <wp:extent cx="3521592" cy="1000418"/>
+            <wp:effectExtent l="19050" t="0" r="2658" b="0"/>
+            <wp:docPr id="4" name="Picture 3" descr="Dominos_v1.4_ImperfectData_DuplicateAddress.png"/>
+            <wp:cNvGraphicFramePr>
+              <a:graphicFrameLocks xmlns:a="http://schemas.openxmlformats.org/drawingml/2006/main" noChangeAspect="1"/>
+            </wp:cNvGraphicFramePr>
+            <a:graphic xmlns:a="http://schemas.openxmlformats.org/drawingml/2006/main">
+              <a:graphicData uri="http://schemas.openxmlformats.org/drawingml/2006/picture">
+                <pic:pic xmlns:pic="http://schemas.openxmlformats.org/drawingml/2006/picture">
+                  <pic:nvPicPr>
+                    <pic:cNvPr id="0" name="Dominos_v1.4_ImperfectData_DuplicateAddress.png"/>
+                    <pic:cNvPicPr/>
+                  </pic:nvPicPr>
+                  <pic:blipFill>
+                    <a:blip r:embed="rId6"/>
+                    <a:stretch>
+                      <a:fillRect/>
+                    </a:stretch>
+                  </pic:blipFill>
+                  <pic:spPr>
+                    <a:xfrm>
+                      <a:off x="0" y="0"/>
+                      <a:ext cx="3535038" cy="1004238"/>
+                    </a:xfrm>
+                    <a:prstGeom prst="rect">
+                      <a:avLst/>
+                    </a:prstGeom>
+                  </pic:spPr>
+                </pic:pic>
+              </a:graphicData>
+            </a:graphic>
+          </wp:inline>
+        </w:drawing>
+      </w:r>
+    </w:p>
+    <w:p>
+      <w:pPr>
+        <w:pStyle w:val="Heading2"/>
+      </w:pPr>
+      <w:r>
+        <w:rPr>
+          <w:noProof/>
+        </w:rPr>
+        <w:drawing>
+          <wp:inline distT="0" distB="0" distL="0" distR="0">
+            <wp:extent cx="3524742" cy="1590897"/>
+            <wp:effectExtent l="19050" t="0" r="0" b="0"/>
+            <wp:docPr id="5" name="Picture 4" descr="Dominos_v1.4_ImperfectData_MissingStorePhone.png"/>
+            <wp:cNvGraphicFramePr>
+              <a:graphicFrameLocks xmlns:a="http://schemas.openxmlformats.org/drawingml/2006/main" noChangeAspect="1"/>
+            </wp:cNvGraphicFramePr>
+            <a:graphic xmlns:a="http://schemas.openxmlformats.org/drawingml/2006/main">
+              <a:graphicData uri="http://schemas.openxmlformats.org/drawingml/2006/picture">
+                <pic:pic xmlns:pic="http://schemas.openxmlformats.org/drawingml/2006/picture">
+                  <pic:nvPicPr>
+                    <pic:cNvPr id="0" name="Dominos_v1.4_ImperfectData_MissingStorePhone.png"/>
+                    <pic:cNvPicPr/>
+                  </pic:nvPicPr>
+                  <pic:blipFill>
+                    <a:blip r:embed="rId7"/>
+                    <a:stretch>
+                      <a:fillRect/>
+                    </a:stretch>
+                  </pic:blipFill>
+                  <pic:spPr>
+                    <a:xfrm>
+                      <a:off x="0" y="0"/>
+                      <a:ext cx="3524742" cy="1590897"/>
+                    </a:xfrm>
+                    <a:prstGeom prst="rect">
+                      <a:avLst/>
+                    </a:prstGeom>
+                  </pic:spPr>
+                </pic:pic>
+              </a:graphicData>
+            </a:graphic>
+          </wp:inline>
+        </w:drawing>
+      </w:r>
+    </w:p>
+    <w:p>
+      <w:pPr>
+        <w:pStyle w:val="Heading2"/>
+      </w:pPr>
+      <w:r>
+        <w:t>Data-Quality Impact and Prevention</w:t>
+      </w:r>
+    </w:p>
+    <w:p>
+      <w:r>
+        <w:t>Poor data can create customer-service problems and weaken reporting. A missing store phone number can make it harder to contact a location, duplicate addresses can distort customer-address counts, and poorly formatted names can reduce the quality of customer communication. In production, the ordering application should require essential fields, apply consistent formatting before data is saved, and flag incomplete or duplicate records for review.</w:t>
+      </w:r>
+    </w:p>
+    <w:p>
+      <w:pPr>
+        <w:pStyle w:val="Heading2"/>
+      </w:pPr>
       <w:r>
         <w:lastRenderedPageBreak/>
-        <w:t>These records do not violate the database’s structural rules. They represent issues that a real organization may need to identify through data-quality reporting.</w:t>
-      </w:r>
-    </w:p>
-    <w:p>
-      <w:pPr>
-        <w:pStyle w:val="Heading2"/>
-      </w:pPr>
-      <w:r>
-        <w:t>Data-Quality Impact and Prevention</w:t>
-      </w:r>
-    </w:p>
-    <w:p>
-      <w:r>
-        <w:t>Bad data can cause customer-service problems and inaccurate reports. A missing store phone number can make it harder for customers or staff to contact the store. Duplicate addresses can produce misleading customer-address counts. Poorly formatted names can reduce the quality of customer-facing communication.</w:t>
-      </w:r>
-    </w:p>
-    <w:p>
-      <w:r>
-        <w:t>In production, the ordering application should require the information needed for each record. It should apply consistent formatting rules before saving customer data. Staff should review exceptions, and the business should run reports that flag incomplete or duplicate records.</w:t>
-      </w:r>
-    </w:p>
-    <w:p>
-      <w:pPr>
-        <w:pStyle w:val="Heading2"/>
-      </w:pPr>
-      <w:r>
         <w:t>Integrity Enforcement</w:t>
       </w:r>
     </w:p>
     <w:p>
       <w:r>
-        <w:t>Primary keys and foreign keys enforce the core relationships in the database. Check constraints prevent invalid statuses, unsupported fulfillment types, and negative monetary values. Unique constraints prevent duplicate values where the business requires them.</w:t>
-      </w:r>
-    </w:p>
-    <w:p>
-      <w:r>
-        <w:t>The script also includes an integrity-audit view. It checks cross-table rules that are not enforced automatically by a single table constraint. For example, it checks whether an order item belongs to the correct store and whether a completed order has matching successful payments. The build script stops with an error if the audit finds an integrity issue.</w:t>
+        <w:t>Primary keys, foreign keys, check constraints, and unique constraints enforce the database’s core structural rules. The implementation also includes an integrity-audit view for cross-table conditions that cannot be enforced by a single table constraint. For example, it checks whether an order item belongs to the correct store and whether a completed order has matching successful payments. The build script stops with an error if the audit identifies an integrity issue.</w:t>
       </w:r>
     </w:p>
     <w:sectPr>
@@ -432,6 +618,36 @@
       <w:szCs w:val="20"/>
     </w:rPr>
   </w:style>
+  <w:style w:type="paragraph" w:styleId="BalloonText">
+    <w:name w:val="Balloon Text"/>
+    <w:basedOn w:val="Normal"/>
+    <w:link w:val="BalloonTextChar"/>
+    <w:uiPriority w:val="99"/>
+    <w:semiHidden/>
+    <w:unhideWhenUsed/>
+    <w:rsid w:val="00870C2A"/>
+    <w:pPr>
+      <w:spacing w:after="0" w:line="240" w:lineRule="auto"/>
+    </w:pPr>
+    <w:rPr>
+      <w:rFonts w:ascii="Tahoma" w:hAnsi="Tahoma" w:cs="Tahoma"/>
+      <w:sz w:val="16"/>
+      <w:szCs w:val="16"/>
+    </w:rPr>
+  </w:style>
+  <w:style w:type="character" w:customStyle="1" w:styleId="BalloonTextChar">
+    <w:name w:val="Balloon Text Char"/>
+    <w:basedOn w:val="DefaultParagraphFont"/>
+    <w:link w:val="BalloonText"/>
+    <w:uiPriority w:val="99"/>
+    <w:semiHidden/>
+    <w:rsid w:val="00870C2A"/>
+    <w:rPr>
+      <w:rFonts w:ascii="Tahoma" w:hAnsi="Tahoma" w:cs="Tahoma"/>
+      <w:sz w:val="16"/>
+      <w:szCs w:val="16"/>
+    </w:rPr>
+  </w:style>
 </w:styles>
 </file>
 

</xml_diff>